<commit_message>
Added latest changes. Updated march 2023.
</commit_message>
<xml_diff>
--- a/resume.docx
+++ b/resume.docx
@@ -7,29 +7,17 @@
         <w:pStyle w:val="Heading1"/>
       </w:pPr>
       <w:r>
-        <w:t>SDMS</w:t>
+        <w:t>Sergio D Munoz</w:t>
       </w:r>
       <w:r>
         <w:rPr>
           <w:b/>
         </w:rPr>
         <w:br/>
-        <w:t>DreamJob</w:t>
+        <w:t>Future Master of Science in Analytics</w:t>
       </w:r>
     </w:p>
-    <w:p>
-      <w:pPr>
-        <w:pStyle w:val="Heading2"/>
-      </w:pPr>
-      <w:r>
-        <w:t>Education</w:t>
-      </w:r>
-    </w:p>
-    <w:p>
-      <w:r>
-        <w:t>Bachelors degree in Computer Science and Minor in Math from UTEP</w:t>
-      </w:r>
-    </w:p>
+    <w:p/>
     <w:p>
       <w:pPr>
         <w:pStyle w:val="Heading2"/>
@@ -39,58 +27,308 @@
       </w:r>
     </w:p>
     <w:p>
+      <w:pPr>
+        <w:pStyle w:val="Heading3"/>
+        <w:jc w:val="both"/>
+      </w:pPr>
       <w:r>
-        <w:t>Role: Founder</w:t>
-        <w:br/>
-        <w:t>Company: Cleta LLC.</w:t>
-        <w:br/>
-        <w:t>Dates: August 2020 - Present</w:t>
-        <w:br/>
-        <w:t>Location: Arlington, VA</w:t>
-        <w:br/>
-        <w:t>Projects:</w:t>
-        <w:br/>
-        <w:t>{'name': 'Cleta.io', 'description': 'Web3 automated serverless architecture running on AWS prototype.', 'duration': '2 years', 'team_size': 5, 'actions': ['Architecture and deploy a serverless cloud infrastructure.', 'Implemented GraphQL schemas, queries, and mutations, tested with AVA.', 'UI/UX design with interactive wireframing into fullstrack js integrations.', 'Continuous Delivery from hot-commit to global within 3 minutes.', 'Smart contracts with tets to deploy into Infura or private Ethereum cloud nodes.', 'Client facing on cutting edge technologies.Web3 technology vision, strategy and direction.'], 'skills': ['aws-amplify', 'aws-dynamo', 'aws-s3', 'aws-route53', 'aws-vpc', 'graphql', 'ava', 'adobe-xd', 'nuxt', 'solidity']}</w:t>
+        <w:t>Solutions Architect at PubNub in SF, CA - (Remote) Arlington, VA - May 2022 - Present</w:t>
       </w:r>
     </w:p>
     <w:p>
+      <w:pPr>
+        <w:jc w:val="left"/>
+      </w:pPr>
       <w:r>
-        <w:t>Role: Principal Full Stack</w:t>
+        <w:rPr>
+          <w:b/>
+        </w:rPr>
         <w:br/>
-        <w:t>Company: Infinitive</w:t>
+        <w:t>PubNub Client Excellence for Ongoing:</w:t>
         <w:br/>
-        <w:t>Dates: Jan 2022 - May 2022</w:t>
+      </w:r>
+      <w:r>
+        <w:rPr>
+          <w:i/>
+        </w:rPr>
+        <w:t>Solutions Architect</w:t>
         <w:br/>
-        <w:t>Location: Ashburn, VA</w:t>
+      </w:r>
+      <w:r>
+        <w:t>- Client facing on pub/sub cutting edge technologies.</w:t>
         <w:br/>
-        <w:t>Projects:</w:t>
+      </w:r>
+      <w:r>
+        <w:t>- Quickly learn client's use case, provide best practices, code snippets, etc.</w:t>
         <w:br/>
-        <w:t>{'name': 'Capital One: Purple Rain', 'description': 'AWS Optimization for performance and cost on log metrics.', 'duration': '6 months', 'team_size': 0, 'actions': ['Ingest semi-structured data insto singe repository, apply cleansing, enrichment, business logic rules.', 'Self service through custom Models into playbooks.', 'Story telling including KPIs, Dashboards and Scoreboards that utilized proven design strategies.'], 'skills': ['log-stash', 'elastic-stack', 'ansible', 'Data-Driven Culture', 'datadog', 'kibana']}</w:t>
+      </w:r>
+      <w:r>
+        <w:t>- Tools include many use cases and scripts to simulate usage, failures and to quickly implement PubNub server side.</w:t>
+        <w:br/>
+      </w:r>
+      <w:r>
+        <w:t>- Pre/Post sales technical pitches, analysis, demos, solutions, use-cases, etc.</w:t>
+        <w:br/>
+      </w:r>
+      <w:r>
+        <w:t>- Monitor client's usage and provide recommendations to optimize for cost, performance and security.</w:t>
+        <w:br/>
+      </w:r>
+      <w:r>
+        <w:t>- Provide technical support to clients and internal teams.</w:t>
+        <w:br/>
+      </w:r>
+      <w:r>
+        <w:rPr>
+          <w:b/>
+        </w:rPr>
+        <w:br/>
+        <w:t>Internal Developer Tools for 4 months:</w:t>
+        <w:br/>
+      </w:r>
+      <w:r>
+        <w:rPr>
+          <w:i/>
+        </w:rPr>
+        <w:t>Metrics API and Python Tools</w:t>
+        <w:br/>
+      </w:r>
+      <w:r>
+        <w:t>- Use Python to build a CLI 'sdk' on top of PubNub's metrics api.</w:t>
+        <w:br/>
+      </w:r>
+      <w:r>
+        <w:t>- ETL using Pandas and metric enrichment using .csv files.</w:t>
+        <w:br/>
+      </w:r>
+      <w:r>
+        <w:t>- Includes deployment on AWS via EB and Flask/FastAPI.</w:t>
+        <w:br/>
+      </w:r>
+      <w:r>
+        <w:t>- Tools use cases and scripts to simulate usage, failures and to quickly implement PubNub server side.</w:t>
+        <w:br/>
       </w:r>
     </w:p>
     <w:p>
+      <w:pPr>
+        <w:pStyle w:val="Heading3"/>
+        <w:jc w:val="both"/>
+      </w:pPr>
       <w:r>
-        <w:t>Role: Lead Software Engineer</w:t>
-        <w:br/>
-        <w:t>Company: Leidos, Inc.</w:t>
-        <w:br/>
-        <w:t>Dates: Jan 2018 - Jan 2022</w:t>
-        <w:br/>
-        <w:t>Location: Reston, VA</w:t>
-        <w:br/>
-        <w:t>Projects:</w:t>
-        <w:br/>
-        <w:t>{'name': 'Cloud Distributed Scraping System', 'description': 'Led a team to architect and create a web scraper prototype.', 'duration': '1 year', 'team_size': 5, 'actions': ['Manage and orchestrate environment with fullstack automation of 20+ microservices.', 'Scripts that accelerated deployment time from days to less than 10 minutes.', 'Continuous integration and testing into a testing environment backend API app.', 'Cloud deploy and maintain testing and production environments.', 'Software engineering on all levels of the stack.', 'Data pipeline management with visualizations at different spots.'], 'skills': ['docker-compose', 'bash', 'gitlab-ops', 'express', 'aws', 'kafka', 'python', 'redis', 'elastic-search', 'minio', 'traefik', 'sql']}</w:t>
-        <w:br/>
-        <w:t>{'name': 'Spring Backend Microservices', 'description': 'Lead a team to implement a data searching backend app.', 'duration': '2 years', 'team_size': 7, 'actions': ['Deliver a SpringBoot app that provides backend microservices oriented APIs.', 'Scripts that interacts with containers to perform management actions.', 'Setup REST environment to allow CRUD and advanced operations and interactions.', 'Secure File management with SSL enabled, file metadata to SQL with custom validation.', 'Analyze the code against security and coverage metrics. Raised from 35% to 75% in code coverage. Fixed 100+ bugs.'], 'skills': ['spring-boot', 'spring-data', 'docker-compose', 'gitlab-ops', 'mvn-spring-profiles', 'minio', 'sonarqube']}</w:t>
-        <w:br/>
-        <w:t>{'name': 'AWS Metrics Analysis', 'description': 'R&amp;D: Python AWS CloudWatch metrics analyzer.', 'duration': '2 months', 'team_size': 1, 'actions': ['Prototype analysis on metrics from AWS uaing only python.', 'Real-time Cloudwatch parsing from multiple AWS instances of type Redis and S3.', 'Deploy a dynamic flask app where metrics were organized and added to a local database.', 'Forecast usage and cost per active instance using AI models and big data analysis.', 'Automatic unit and regression testing with over 95% code coverage.'], 'skills': ['python-boto3', 'python-flask', 'python-pands', 'python-sqlalchemy', 'tensorflow', 'python-pytest', 'sql-lite']}</w:t>
-        <w:br/>
-        <w:t>{'name': 'Healthcare - mlnOpedia', 'description': 'Mobile App and services support.', 'duration': '3 months', 'team_size': 10, 'actions': ['Helped on the development of the Android portion of the project.', 'Added push notifications with firebase to alert users on recommendations and updates.', 'Scripts that automated safe data bulk upload to local and remote servers. Now used across the company.'], 'skills': ['java-android', 'objectivec', 'python']}</w:t>
-        <w:br/>
-        <w:t>{'name': 'Android Bluetooth Microprocessor Technology', 'description': 'R&amp;D: Android bluetooth beacon modification and discovery', 'duration': '2 months', 'team_size': 3, 'actions': ['Maintain and update low level code to run on any linux device that can run BlueZ protocol.', 'Prototyped a bluetooth mesh using 4 raspberry devices.', 'Ability to track and locate users using bluetooth beacon packets.'], 'skills': ['java-android', 'c']}</w:t>
+        <w:t>Principal Full Stack at Infinitive in Ashburn, VA - Jan 2022 - May 2022</w:t>
       </w:r>
     </w:p>
+    <w:p>
+      <w:pPr>
+        <w:jc w:val="left"/>
+      </w:pPr>
+      <w:r>
+        <w:rPr>
+          <w:b/>
+        </w:rPr>
+        <w:br/>
+        <w:t>Capital One - Purple Rain for 6 months:</w:t>
+        <w:br/>
+      </w:r>
+      <w:r>
+        <w:rPr>
+          <w:i/>
+        </w:rPr>
+        <w:t>AWS Optimization for performance and cost on log metrics.</w:t>
+        <w:br/>
+      </w:r>
+      <w:r>
+        <w:t>- Ingest semi-structured data into singe repository, apply cleansing, enrichment, business logic rules.</w:t>
+        <w:br/>
+      </w:r>
+      <w:r>
+        <w:t>- Self service through custom Models into playbooks.</w:t>
+        <w:br/>
+      </w:r>
+      <w:r>
+        <w:t>- Story telling including KPIs, Dashboards and Scoreboards that utilized proven design strategies.</w:t>
+        <w:br/>
+      </w:r>
+    </w:p>
+    <w:p>
+      <w:pPr>
+        <w:pStyle w:val="Heading3"/>
+        <w:jc w:val="both"/>
+      </w:pPr>
+      <w:r>
+        <w:t>Lead Software Engineer at Leidos, Inc. in Reston, VA - Jan 2018 - Jan 2022</w:t>
+      </w:r>
+    </w:p>
+    <w:p>
+      <w:pPr>
+        <w:jc w:val="left"/>
+      </w:pPr>
+      <w:r>
+        <w:rPr>
+          <w:b/>
+        </w:rPr>
+        <w:br/>
+        <w:t>Cloud Distributed Scraping System for 1 year:</w:t>
+        <w:br/>
+      </w:r>
+      <w:r>
+        <w:rPr>
+          <w:i/>
+        </w:rPr>
+        <w:t>Led a team to architect and create a web scraper prototype.</w:t>
+        <w:br/>
+      </w:r>
+      <w:r>
+        <w:t>- Manage and orchestrate environment with fullstack automation of 20+ microservices.</w:t>
+        <w:br/>
+      </w:r>
+      <w:r>
+        <w:t>- Scripts that accelerated deployment time from days to less than 10 minutes.</w:t>
+        <w:br/>
+      </w:r>
+      <w:r>
+        <w:t>- Continuous integration and testing into a testing environment backend API app.</w:t>
+        <w:br/>
+      </w:r>
+      <w:r>
+        <w:t>- Cloud deploy and maintain testing and production environments.</w:t>
+        <w:br/>
+      </w:r>
+      <w:r>
+        <w:t>- Software engineering on all levels of the stack.</w:t>
+        <w:br/>
+      </w:r>
+      <w:r>
+        <w:t>- Data pipeline management with visualizations at different spots.</w:t>
+        <w:br/>
+      </w:r>
+      <w:r>
+        <w:rPr>
+          <w:b/>
+        </w:rPr>
+        <w:br/>
+        <w:t>Spring Backend Microservices for 2 years:</w:t>
+        <w:br/>
+      </w:r>
+      <w:r>
+        <w:rPr>
+          <w:i/>
+        </w:rPr>
+        <w:t>Lead a team to implement a data searching backend app.</w:t>
+        <w:br/>
+      </w:r>
+      <w:r>
+        <w:t>- Deliver a SpringBoot app that provides backend microservices oriented APIs.</w:t>
+        <w:br/>
+      </w:r>
+      <w:r>
+        <w:t>- Scripts that interacts with containers to perform management actions.</w:t>
+        <w:br/>
+      </w:r>
+      <w:r>
+        <w:t>- Setup REST environment to allow CRUD and advanced operations and interactions.</w:t>
+        <w:br/>
+      </w:r>
+      <w:r>
+        <w:t>- Secure File management with SSL enabled, file metadata to SQL with custom validation.</w:t>
+        <w:br/>
+      </w:r>
+      <w:r>
+        <w:t>- Analyze the code against security and coverage metrics. Raised from 35% to 75% in code coverage. Fixed 100+ bugs.</w:t>
+        <w:br/>
+      </w:r>
+      <w:r>
+        <w:rPr>
+          <w:b/>
+        </w:rPr>
+        <w:br/>
+        <w:t>AWS Metrics Analysis for 2 months:</w:t>
+        <w:br/>
+      </w:r>
+      <w:r>
+        <w:rPr>
+          <w:i/>
+        </w:rPr>
+        <w:t>R&amp;D: Python AWS CloudWatch metrics analyzer.</w:t>
+        <w:br/>
+      </w:r>
+      <w:r>
+        <w:t>- Prototype analysis on metrics from AWS using only python.</w:t>
+        <w:br/>
+      </w:r>
+      <w:r>
+        <w:t>- Real-time Cloudwatch parsing from multiple AWS instances of type Redis and S3.</w:t>
+        <w:br/>
+      </w:r>
+      <w:r>
+        <w:t>- Deploy a dynamic flask app where metrics were organized and added to a local database.</w:t>
+        <w:br/>
+      </w:r>
+      <w:r>
+        <w:t>- Forecast usage and cost per active instance using AI models and big data analysis.</w:t>
+        <w:br/>
+      </w:r>
+      <w:r>
+        <w:t>- Automatic unit and regression testing with over 95% code coverage.</w:t>
+        <w:br/>
+      </w:r>
+      <w:r>
+        <w:rPr>
+          <w:b/>
+        </w:rPr>
+        <w:br/>
+        <w:t>Healthcare - mlnOpedia for 3 months:</w:t>
+        <w:br/>
+      </w:r>
+      <w:r>
+        <w:rPr>
+          <w:i/>
+        </w:rPr>
+        <w:t>Mobile App and services support.</w:t>
+        <w:br/>
+      </w:r>
+      <w:r>
+        <w:t>- Helped on the development of the Android portion of the project.</w:t>
+        <w:br/>
+      </w:r>
+      <w:r>
+        <w:t>- Added push notifications with firebase to alert users on recommendations and updates.</w:t>
+        <w:br/>
+      </w:r>
+      <w:r>
+        <w:t>- Scripts that automated safe data bulk upload to local and remote servers. Now used across the company.</w:t>
+        <w:br/>
+      </w:r>
+      <w:r>
+        <w:rPr>
+          <w:b/>
+        </w:rPr>
+        <w:br/>
+        <w:t>Android Bluetooth Microprocessor Technology for 2 months:</w:t>
+        <w:br/>
+      </w:r>
+      <w:r>
+        <w:rPr>
+          <w:i/>
+        </w:rPr>
+        <w:t>R&amp;D: Android bluetooth beacon modification and discovery</w:t>
+        <w:br/>
+      </w:r>
+      <w:r>
+        <w:t>- Maintain and update low level code to run on any linux device that can run BlueZ protocol.</w:t>
+        <w:br/>
+      </w:r>
+      <w:r>
+        <w:t>- Prototyped a bluetooth mesh using 4 raspberry devices.</w:t>
+        <w:br/>
+      </w:r>
+      <w:r>
+        <w:t>- Ability to track and locate users using bluetooth beacon packets.</w:t>
+        <w:br/>
+      </w:r>
+    </w:p>
+    <w:p/>
     <w:p>
       <w:pPr>
         <w:pStyle w:val="Heading2"/>
@@ -100,313 +338,123 @@
       </w:r>
     </w:p>
     <w:p>
+      <w:pPr>
+        <w:pStyle w:val="Heading3"/>
+      </w:pPr>
       <w:r>
-        <w:t>postman</w:t>
+        <w:t>Experience Skills</w:t>
+      </w:r>
+    </w:p>
+    <w:p>
+      <w:pPr>
+        <w:jc w:val="both"/>
+      </w:pPr>
+      <w:r>
+        <w:rPr>
+          <w:b/>
+        </w:rPr>
+        <w:t xml:space="preserve">PubNub Client Excellence: </w:t>
+      </w:r>
+      <w:r>
+        <w:t>architecture, security, performance, analysis, communication, realtime, pub/sub, pubnub</w:t>
+        <w:br/>
+      </w:r>
+      <w:r>
+        <w:rPr>
+          <w:b/>
+        </w:rPr>
+        <w:t xml:space="preserve">Internal Developer Tools: </w:t>
+      </w:r>
+      <w:r>
+        <w:t>python, csv, metrics-api, cli-tools, github-actions, aws-eb, aws-ec2, flask, fast-api, pubnub</w:t>
+        <w:br/>
+      </w:r>
+      <w:r>
+        <w:rPr>
+          <w:b/>
+        </w:rPr>
+        <w:t xml:space="preserve">Capital One - Purple Rain: </w:t>
+      </w:r>
+      <w:r>
+        <w:t>log-stash, elastic-stack, ansible, Data-Driven Culture, datadog, kibana, aws</w:t>
+        <w:br/>
+      </w:r>
+      <w:r>
+        <w:rPr>
+          <w:b/>
+        </w:rPr>
+        <w:t xml:space="preserve">Cloud Distributed Scraping System: </w:t>
+      </w:r>
+      <w:r>
+        <w:t>docker-compose, bash, gitlab-ops, express, aws, kafka, python, redis, elastic-search, minio, traefik, sql</w:t>
+        <w:br/>
+      </w:r>
+      <w:r>
+        <w:rPr>
+          <w:b/>
+        </w:rPr>
+        <w:t xml:space="preserve">Spring Backend Microservices: </w:t>
+      </w:r>
+      <w:r>
+        <w:t>spring-boot, spring-data, docker-compose, gitlab-ops, mvn-spring-profiles, minio, sonarqube</w:t>
+        <w:br/>
+      </w:r>
+      <w:r>
+        <w:rPr>
+          <w:b/>
+        </w:rPr>
+        <w:t xml:space="preserve">AWS Metrics Analysis: </w:t>
+      </w:r>
+      <w:r>
+        <w:t>python-boto3, python-flask, python-pandas, python-sqlalchemy, tensorflow, python-pytest, sql-lite</w:t>
+        <w:br/>
+      </w:r>
+      <w:r>
+        <w:rPr>
+          <w:b/>
+        </w:rPr>
+        <w:t xml:space="preserve">Healthcare - mlnOpedia: </w:t>
+      </w:r>
+      <w:r>
+        <w:t>java-android, objectivec, python</w:t>
+        <w:br/>
+      </w:r>
+      <w:r>
+        <w:rPr>
+          <w:b/>
+        </w:rPr>
+        <w:t xml:space="preserve">Android Bluetooth Microprocessor Technology: </w:t>
+      </w:r>
+      <w:r>
+        <w:t>java-android, c</w:t>
+        <w:br/>
+      </w:r>
+    </w:p>
+    <w:p>
+      <w:pPr>
+        <w:pStyle w:val="Heading3"/>
+      </w:pPr>
+      <w:r>
+        <w:t>Related Skills (A-z)</w:t>
       </w:r>
     </w:p>
     <w:p>
       <w:r>
-        <w:t>REST</w:t>
+        <w:t>REST, ansible, arch-linux, aws-amplify, aws-aurora, aws-cloudformation, aws-codepipeline, aws-iam, aws-serverless, aws-vpc, bash, centos, consul, css, debian, docker, docker-compose, docker-images, docker-swarm, elastic-search, elastic-stack, english-fluent, french-wp, git, github-actions, gitlab-cicd, graphql, html, java-8+, java-android, jinja, js-express, js-node, js-nuxt, js-vue, kafka, kibana, kubernetes-training, log-stash, mint, mongo-db, mvn, php, postman, proxmox, python-flask, python-pandas, python-scrapy, python2, python3, redis, solidity, sonarqube, spanish-fluent, spring-boot, spring-data, spring-profiles, spring-security, sql, swagger-api, ubuntu-flavors, vim, yarn</w:t>
+      </w:r>
+    </w:p>
+    <w:p/>
+    <w:p>
+      <w:pPr>
+        <w:pStyle w:val="Heading2"/>
+      </w:pPr>
+      <w:r>
+        <w:t>Activities</w:t>
       </w:r>
     </w:p>
     <w:p>
       <w:r>
-        <w:t>sonarqube</w:t>
-      </w:r>
-    </w:p>
-    <w:p>
-      <w:r>
-        <w:t>swagger-api</w:t>
-      </w:r>
-    </w:p>
-    <w:p>
-      <w:r>
-        <w:t>aws-aurora</w:t>
-      </w:r>
-    </w:p>
-    <w:p>
-      <w:r>
-        <w:t>mongo-db</w:t>
-      </w:r>
-    </w:p>
-    <w:p>
-      <w:r>
-        <w:t>graphql</w:t>
-      </w:r>
-    </w:p>
-    <w:p>
-      <w:r>
-        <w:t>redis</w:t>
-      </w:r>
-    </w:p>
-    <w:p>
-      <w:r>
-        <w:t>sql</w:t>
-      </w:r>
-    </w:p>
-    <w:p>
-      <w:r>
-        <w:t>java-8+</w:t>
-      </w:r>
-    </w:p>
-    <w:p>
-      <w:r>
-        <w:t>java-android</w:t>
-      </w:r>
-    </w:p>
-    <w:p>
-      <w:r>
-        <w:t>mvn</w:t>
-      </w:r>
-    </w:p>
-    <w:p>
-      <w:r>
-        <w:t>js-node</w:t>
-      </w:r>
-    </w:p>
-    <w:p>
-      <w:r>
-        <w:t>js-vue</w:t>
-      </w:r>
-    </w:p>
-    <w:p>
-      <w:r>
-        <w:t>js-nuxt</w:t>
-      </w:r>
-    </w:p>
-    <w:p>
-      <w:r>
-        <w:t>js-express</w:t>
-      </w:r>
-    </w:p>
-    <w:p>
-      <w:r>
-        <w:t>python2</w:t>
-      </w:r>
-    </w:p>
-    <w:p>
-      <w:r>
-        <w:t>python3</w:t>
-      </w:r>
-    </w:p>
-    <w:p>
-      <w:r>
-        <w:t>python-scrapy</w:t>
-      </w:r>
-    </w:p>
-    <w:p>
-      <w:r>
-        <w:t>python-flask</w:t>
-      </w:r>
-    </w:p>
-    <w:p>
-      <w:r>
-        <w:t>python-pandas</w:t>
-      </w:r>
-    </w:p>
-    <w:p>
-      <w:r>
-        <w:t>spring-boot</w:t>
-      </w:r>
-    </w:p>
-    <w:p>
-      <w:r>
-        <w:t>spring-security</w:t>
-      </w:r>
-    </w:p>
-    <w:p>
-      <w:r>
-        <w:t>spring-profiles</w:t>
-      </w:r>
-    </w:p>
-    <w:p>
-      <w:r>
-        <w:t>spring-data</w:t>
-      </w:r>
-    </w:p>
-    <w:p>
-      <w:r>
-        <w:t>bash</w:t>
-      </w:r>
-    </w:p>
-    <w:p>
-      <w:r>
-        <w:t>kafka</w:t>
-      </w:r>
-    </w:p>
-    <w:p>
-      <w:r>
-        <w:t>vim</w:t>
-      </w:r>
-    </w:p>
-    <w:p>
-      <w:r>
-        <w:t>yarn</w:t>
-      </w:r>
-    </w:p>
-    <w:p>
-      <w:r>
-        <w:t>solidity</w:t>
-      </w:r>
-    </w:p>
-    <w:p>
-      <w:r>
-        <w:t>html</w:t>
-      </w:r>
-    </w:p>
-    <w:p>
-      <w:r>
-        <w:t>css</w:t>
-      </w:r>
-    </w:p>
-    <w:p>
-      <w:r>
-        <w:t>php</w:t>
-      </w:r>
-    </w:p>
-    <w:p>
-      <w:r>
-        <w:t>git</w:t>
-      </w:r>
-    </w:p>
-    <w:p>
-      <w:r>
-        <w:t>github-actions</w:t>
-      </w:r>
-    </w:p>
-    <w:p>
-      <w:r>
-        <w:t>gitlab-cicd</w:t>
-      </w:r>
-    </w:p>
-    <w:p>
-      <w:r>
-        <w:t>aws-amplify</w:t>
-      </w:r>
-    </w:p>
-    <w:p>
-      <w:r>
-        <w:t>aws-iam</w:t>
-      </w:r>
-    </w:p>
-    <w:p>
-      <w:r>
-        <w:t>aws-serverless</w:t>
-      </w:r>
-    </w:p>
-    <w:p>
-      <w:r>
-        <w:t>aws-vpc</w:t>
-      </w:r>
-    </w:p>
-    <w:p>
-      <w:r>
-        <w:t>aws-codepipeline</w:t>
-      </w:r>
-    </w:p>
-    <w:p>
-      <w:r>
-        <w:t>aws-cloudformation</w:t>
-      </w:r>
-    </w:p>
-    <w:p>
-      <w:r>
-        <w:t>ansible</w:t>
-      </w:r>
-    </w:p>
-    <w:p>
-      <w:r>
-        <w:t>consul</w:t>
-      </w:r>
-    </w:p>
-    <w:p>
-      <w:r>
-        <w:t>kubernetes-training</w:t>
-      </w:r>
-    </w:p>
-    <w:p>
-      <w:r>
-        <w:t>docker</w:t>
-      </w:r>
-    </w:p>
-    <w:p>
-      <w:r>
-        <w:t>docker-compose</w:t>
-      </w:r>
-    </w:p>
-    <w:p>
-      <w:r>
-        <w:t>docker-swarm</w:t>
-      </w:r>
-    </w:p>
-    <w:p>
-      <w:r>
-        <w:t>docker-images</w:t>
-      </w:r>
-    </w:p>
-    <w:p>
-      <w:r>
-        <w:t>elastic-stack</w:t>
-      </w:r>
-    </w:p>
-    <w:p>
-      <w:r>
-        <w:t>elastic-search</w:t>
-      </w:r>
-    </w:p>
-    <w:p>
-      <w:r>
-        <w:t>log-stash</w:t>
-      </w:r>
-    </w:p>
-    <w:p>
-      <w:r>
-        <w:t>kibana</w:t>
-      </w:r>
-    </w:p>
-    <w:p>
-      <w:r>
-        <w:t>arch-linux</w:t>
-      </w:r>
-    </w:p>
-    <w:p>
-      <w:r>
-        <w:t>centos</w:t>
-      </w:r>
-    </w:p>
-    <w:p>
-      <w:r>
-        <w:t>debian</w:t>
-      </w:r>
-    </w:p>
-    <w:p>
-      <w:r>
-        <w:t>mint</w:t>
-      </w:r>
-    </w:p>
-    <w:p>
-      <w:r>
-        <w:t>xbuntu</w:t>
-      </w:r>
-    </w:p>
-    <w:p>
-      <w:r>
-        <w:t>proxmox</w:t>
-      </w:r>
-    </w:p>
-    <w:p>
-      <w:r>
-        <w:t>english-fluent</w:t>
-      </w:r>
-    </w:p>
-    <w:p>
-      <w:r>
-        <w:t>spanish-fluent</w:t>
-      </w:r>
-    </w:p>
-    <w:p>
-      <w:r>
-        <w:t>french-wp</w:t>
+        <w:t>1st Place - 2019 RESET Hackathon (Blockchain), 2nd Place - 2021 Verac Hackathon (Android), 3rd Place - 2018 UTD Research Symposium (Android), 4th Place - 2020 SANS Institute CTF (Pen Testing)</w:t>
       </w:r>
     </w:p>
     <w:p>
@@ -1067,6 +1115,38 @@
           </w:p>
         </w:tc>
       </w:tr>
+      <w:tr>
+        <w:tc>
+          <w:tcPr>
+            <w:tcW w:type="dxa" w:w="2880"/>
+          </w:tcPr>
+          <w:p>
+            <w:r>
+              <w:t>Design Patterns in Python</w:t>
+            </w:r>
+          </w:p>
+        </w:tc>
+        <w:tc>
+          <w:tcPr>
+            <w:tcW w:type="dxa" w:w="2880"/>
+          </w:tcPr>
+          <w:p>
+            <w:r>
+              <w:t>Udemy</w:t>
+            </w:r>
+          </w:p>
+        </w:tc>
+        <w:tc>
+          <w:tcPr>
+            <w:tcW w:type="dxa" w:w="2880"/>
+          </w:tcPr>
+          <w:p>
+            <w:r>
+              <w:t>Feb 2023</w:t>
+            </w:r>
+          </w:p>
+        </w:tc>
+      </w:tr>
     </w:tbl>
     <w:sectPr>
       <w:pgSz w:w="12240" w:h="15840"/>

</xml_diff>